<commit_message>
Assignment 4 word doc
</commit_message>
<xml_diff>
--- a/Programming_Exercise_4/MariaGalante_ProgrammingExercise_4.docx
+++ b/Programming_Exercise_4/MariaGalante_ProgrammingExercise_4.docx
@@ -76,16 +76,8 @@
         <w:rPr>
           <w:rFonts w:cs="Times New Roman"/>
         </w:rPr>
-        <w:t>Advantages of using **</w:t>
+        <w:t>Advantages of using **kwargs</w:t>
       </w:r>
-      <w:proofErr w:type="spellStart"/>
-      <w:r>
-        <w:rPr>
-          <w:rFonts w:cs="Times New Roman"/>
-        </w:rPr>
-        <w:t>kwargs</w:t>
-      </w:r>
-      <w:proofErr w:type="spellEnd"/>
     </w:p>
     <w:p>
       <w:pPr>
@@ -172,16 +164,8 @@
         <w:rPr>
           <w:rFonts w:cs="Times New Roman"/>
         </w:rPr>
-        <w:t>Disadvantages of using **</w:t>
+        <w:t>Disadvantages of using **kwargs</w:t>
       </w:r>
-      <w:proofErr w:type="spellStart"/>
-      <w:r>
-        <w:rPr>
-          <w:rFonts w:cs="Times New Roman"/>
-        </w:rPr>
-        <w:t>kwargs</w:t>
-      </w:r>
-      <w:proofErr w:type="spellEnd"/>
     </w:p>
     <w:p>
       <w:pPr>
@@ -1317,6 +1301,7 @@
   <w:style w:type="character" w:default="1" w:styleId="DefaultParagraphFont">
     <w:name w:val="Default Paragraph Font"/>
     <w:uiPriority w:val="1"/>
+    <w:semiHidden/>
     <w:unhideWhenUsed/>
   </w:style>
   <w:style w:type="table" w:default="1" w:styleId="TableNormal">

</xml_diff>